<commit_message>
feat(nivel2): fortalecer avaliacao, seguranca e E2E
</commit_message>
<xml_diff>
--- a/Docs/relatorio_executivo_implementacao_bytebank.docx
+++ b/Docs/relatorio_executivo_implementacao_bytebank.docx
@@ -49,7 +49,7 @@
                 <w:color w:val="FFFFFF"/>
                 <w:sz w:val="62"/>
               </w:rPr>
-              <w:t>Relatório Executivo de Implementação</w:t>
+              <w:t>Relatório de Executivo</w:t>
               <w:br/>
             </w:r>
             <w:r>
@@ -58,7 +58,7 @@
                 <w:color w:val="E7F4FB"/>
                 <w:sz w:val="26"/>
               </w:rPr>
-              <w:t>Arquitetura, decisões, evidências e prontidão operacional</w:t>
+              <w:t>Visão de resultado, risco e maturidade técnica</w:t>
             </w:r>
           </w:p>
         </w:tc>
@@ -146,12 +146,12 @@
     </w:p>
     <w:p>
       <w:r>
-        <w:t>A solução processa 50 políticas, preserva metadados de domínio e acesso, cria chunks de 500 caracteres com overlap 100, indexa embeddings locais no ChromaDB e combina recuperação vetorial com ranking lexical. O fluxo recupera oito candidatos, aplica reranking e entrega quatro evidências à geração. A avaliação versionada contém oito perguntas e compara o mesmo gabarito com e sem RAG.</w:t>
+        <w:t>A solução processa 50 políticas, preserva metadados de domínio e acesso, cria chunks de 500 caracteres com overlap 100, indexa embeddings locais no ChromaDB e combina recuperação vetorial com ranking lexical. O fluxo recupera oito candidatos, aplica reranking e entrega quatro evidências à geração. A avaliação versionada contém 32 cenários e compara o mesmo gabarito com e sem RAG.</w:t>
       </w:r>
     </w:p>
     <w:p>
       <w:r>
-        <w:t>O resultado observado foi 1/8 sem RAG e 8/8 com RAG. Três casos concluíram geração e julgamento no Gemini; cinco registraram fallback local após HTTP 429. Essa distinção é material: a acurácia do caminho RAG foi 100%, mas a rodada não é apresentada como execução integralmente externa.</w:t>
+        <w:t>O resultado externo observado foi 12/32 sem RAG e 28/32 com RAG. A geração ocorreu no Gemini nos 32 casos; quatro julgamentos registraram fallback local. Essa distinção é material: a acurácia RAG observada foi 87,5%, e a rodada não é apresentada como avaliação integralmente externa.</w:t>
       </w:r>
     </w:p>
     <w:tbl>
@@ -315,7 +315,7 @@
               <w:rPr>
                 <w:sz w:val="17"/>
               </w:rPr>
-              <w:t>8</w:t>
+              <w:t>32</w:t>
             </w:r>
           </w:p>
         </w:tc>
@@ -363,7 +363,7 @@
               <w:rPr>
                 <w:sz w:val="17"/>
               </w:rPr>
-              <w:t>1/8 - 12,5%</w:t>
+              <w:t>12/32 - 37,5%</w:t>
             </w:r>
           </w:p>
         </w:tc>
@@ -413,7 +413,7 @@
               <w:rPr>
                 <w:sz w:val="17"/>
               </w:rPr>
-              <w:t>8/8 - 100%</w:t>
+              <w:t>28/32 - 87,5%</w:t>
             </w:r>
           </w:p>
         </w:tc>
@@ -438,7 +438,7 @@
               <w:rPr>
                 <w:sz w:val="17"/>
               </w:rPr>
-              <w:t>Recuperação com fontes</w:t>
+              <w:t>Geração Gemini</w:t>
             </w:r>
           </w:p>
         </w:tc>
@@ -461,7 +461,7 @@
               <w:rPr>
                 <w:sz w:val="17"/>
               </w:rPr>
-              <w:t>8/8 casos</w:t>
+              <w:t>32/32 casos</w:t>
             </w:r>
           </w:p>
         </w:tc>
@@ -487,7 +487,7 @@
               <w:rPr>
                 <w:sz w:val="17"/>
               </w:rPr>
-              <w:t>Testes unitários</w:t>
+              <w:t>Julgamento com fallback</w:t>
             </w:r>
           </w:p>
         </w:tc>
@@ -511,7 +511,7 @@
               <w:rPr>
                 <w:sz w:val="17"/>
               </w:rPr>
-              <w:t>14/14 aprovados</w:t>
+              <w:t>4/32 casos</w:t>
             </w:r>
           </w:p>
         </w:tc>
@@ -536,6 +536,55 @@
               <w:rPr>
                 <w:sz w:val="17"/>
               </w:rPr>
+              <w:t>Testes unitários e E2E</w:t>
+            </w:r>
+          </w:p>
+        </w:tc>
+        <w:tc>
+          <w:tcPr>
+            <w:tcW w:type="dxa" w:w="4876"/>
+            <w:vAlign w:val="center"/>
+            <w:tcMar>
+              <w:top w:w="90" w:type="dxa"/>
+              <w:start w:w="100" w:type="dxa"/>
+              <w:bottom w:w="90" w:type="dxa"/>
+              <w:end w:w="100" w:type="dxa"/>
+            </w:tcMar>
+          </w:tcPr>
+          <w:p>
+            <w:pPr>
+              <w:spacing w:after="20"/>
+            </w:pPr>
+            <w:r>
+              <w:rPr>
+                <w:sz w:val="17"/>
+              </w:rPr>
+              <w:t>23/23 aprovados</w:t>
+            </w:r>
+          </w:p>
+        </w:tc>
+      </w:tr>
+      <w:tr>
+        <w:tc>
+          <w:tcPr>
+            <w:tcW w:type="dxa" w:w="4876"/>
+            <w:vAlign w:val="center"/>
+            <w:tcMar>
+              <w:top w:w="90" w:type="dxa"/>
+              <w:start w:w="100" w:type="dxa"/>
+              <w:bottom w:w="90" w:type="dxa"/>
+              <w:end w:w="100" w:type="dxa"/>
+            </w:tcMar>
+            <w:shd w:fill="EAF4FB"/>
+          </w:tcPr>
+          <w:p>
+            <w:pPr>
+              <w:spacing w:after="20"/>
+            </w:pPr>
+            <w:r>
+              <w:rPr>
+                <w:sz w:val="17"/>
+              </w:rPr>
               <w:t>Conformidade do projeto</w:t>
             </w:r>
           </w:p>
@@ -550,6 +599,7 @@
               <w:bottom w:w="90" w:type="dxa"/>
               <w:end w:w="100" w:type="dxa"/>
             </w:tcMar>
+            <w:shd w:fill="EAF4FB"/>
           </w:tcPr>
           <w:p>
             <w:pPr>
@@ -575,7 +625,6 @@
               <w:bottom w:w="90" w:type="dxa"/>
               <w:end w:w="100" w:type="dxa"/>
             </w:tcMar>
-            <w:shd w:fill="EAF4FB"/>
           </w:tcPr>
           <w:p>
             <w:pPr>
@@ -599,7 +648,6 @@
               <w:bottom w:w="90" w:type="dxa"/>
               <w:end w:w="100" w:type="dxa"/>
             </w:tcMar>
-            <w:shd w:fill="EAF4FB"/>
           </w:tcPr>
           <w:p>
             <w:pPr>
@@ -1796,7 +1844,7 @@
     </w:p>
     <w:p>
       <w:r>
-        <w:t>filter_by_access() restringe os chunks antes do ranking lexical. No Chroma, o mesmo controle é aplicado por filtro where sobre nivel_acesso. A consulta pública usa somente publico; conteúdo interno não entra no contexto padrão. Em produção, allowed_levels deve ser derivado de identidade e papéis reais, nunca de um valor fornecido livremente pelo cliente.</w:t>
+        <w:t>filter_by_access() restringe os chunks antes do ranking lexical. No Chroma, o mesmo controle é aplicado por filtro where sobre nivel_acesso. A consulta pública usa somente publico; conteúdo interno não entra no contexto padrão. allowed_levels é limitado pelas permissões derivadas da identidade JWT; o MCP valida assinatura, emissor, audiência, expiração e papéis, com suporte configurável a JWKS.</w:t>
       </w:r>
     </w:p>
     <w:p>
@@ -2301,7 +2349,7 @@
     </w:p>
     <w:p>
       <w:r>
-        <w:t>O conjunto de validação contém oito pares de pergunta e gabarito baseados nas políticas. Para cada caso são produzidas uma resposta sem RAG e uma resposta com RAG. O juiz estruturado avalia presença do fato esperado; no caminho RAG, exige também citação de fonte. O CSV registra pergunta, gabarito, respostas, fontes, modo de recuperação, reranking, geração, juiz, notas, justificativas e fallbacks.</w:t>
+        <w:t>O conjunto de validação contém 32 casos versionados, incluindo perguntas diretas, paráfrases, múltiplas fontes, negativas, tentativas de prompt injection, acesso proibido e regressões. Para cada caso são produzidas uma resposta sem RAG e uma resposta com RAG. O juiz estruturado avalia presença do fato esperado; no caminho RAG, exige também citação de fonte. Cache e checkpoint permitem retomar execução. O CSV registra pergunta, gabarito, respostas, fontes, modo de recuperação, reranking, geração, juiz, notas, justificativas, métricas e fallbacks.</w:t>
       </w:r>
     </w:p>
     <w:p>
@@ -2309,7 +2357,7 @@
         <w:pStyle w:val="Heading3"/>
       </w:pPr>
       <w:r>
-        <w:t>6.2 Resultado por caso</w:t>
+        <w:t>6.2 Resultado agregado</w:t>
       </w:r>
     </w:p>
     <w:tbl>
@@ -2320,12 +2368,8 @@
         <w:tblLook w:firstColumn="1" w:firstRow="1" w:lastColumn="0" w:lastRow="0" w:noHBand="0" w:noVBand="1" w:val="04A0"/>
       </w:tblPr>
       <w:tblGrid>
-        <w:gridCol w:w="1625"/>
-        <w:gridCol w:w="1625"/>
-        <w:gridCol w:w="1625"/>
-        <w:gridCol w:w="1625"/>
-        <w:gridCol w:w="1625"/>
-        <w:gridCol w:w="1625"/>
+        <w:gridCol w:w="4876"/>
+        <w:gridCol w:w="4876"/>
       </w:tblGrid>
       <w:tr>
         <w:trPr>
@@ -2333,7 +2377,7 @@
         </w:trPr>
         <w:tc>
           <w:tcPr>
-            <w:tcW w:type="dxa" w:w="1625"/>
+            <w:tcW w:type="dxa" w:w="4876"/>
             <w:vAlign w:val="center"/>
             <w:tcMar>
               <w:top w:w="90" w:type="dxa"/>
@@ -2353,13 +2397,13 @@
                 <w:color w:val="FFFFFF"/>
                 <w:sz w:val="17"/>
               </w:rPr>
-              <w:t>#</w:t>
+              <w:t>Indicador</w:t>
             </w:r>
           </w:p>
         </w:tc>
         <w:tc>
           <w:tcPr>
-            <w:tcW w:type="dxa" w:w="1625"/>
+            <w:tcW w:type="dxa" w:w="4876"/>
             <w:vAlign w:val="center"/>
             <w:tcMar>
               <w:top w:w="90" w:type="dxa"/>
@@ -2379,111 +2423,7 @@
                 <w:color w:val="FFFFFF"/>
                 <w:sz w:val="17"/>
               </w:rPr>
-              <w:t>Tema</w:t>
-            </w:r>
-          </w:p>
-        </w:tc>
-        <w:tc>
-          <w:tcPr>
-            <w:tcW w:type="dxa" w:w="1625"/>
-            <w:vAlign w:val="center"/>
-            <w:tcMar>
-              <w:top w:w="90" w:type="dxa"/>
-              <w:start w:w="100" w:type="dxa"/>
-              <w:bottom w:w="90" w:type="dxa"/>
-              <w:end w:w="100" w:type="dxa"/>
-            </w:tcMar>
-            <w:shd w:fill="0F3557"/>
-          </w:tcPr>
-          <w:p>
-            <w:pPr>
-              <w:spacing w:after="20"/>
-            </w:pPr>
-            <w:r>
-              <w:rPr>
-                <w:b/>
-                <w:color w:val="FFFFFF"/>
-                <w:sz w:val="17"/>
-              </w:rPr>
-              <w:t>Sem RAG</w:t>
-            </w:r>
-          </w:p>
-        </w:tc>
-        <w:tc>
-          <w:tcPr>
-            <w:tcW w:type="dxa" w:w="1625"/>
-            <w:vAlign w:val="center"/>
-            <w:tcMar>
-              <w:top w:w="90" w:type="dxa"/>
-              <w:start w:w="100" w:type="dxa"/>
-              <w:bottom w:w="90" w:type="dxa"/>
-              <w:end w:w="100" w:type="dxa"/>
-            </w:tcMar>
-            <w:shd w:fill="0F3557"/>
-          </w:tcPr>
-          <w:p>
-            <w:pPr>
-              <w:spacing w:after="20"/>
-            </w:pPr>
-            <w:r>
-              <w:rPr>
-                <w:b/>
-                <w:color w:val="FFFFFF"/>
-                <w:sz w:val="17"/>
-              </w:rPr>
-              <w:t>Com RAG</w:t>
-            </w:r>
-          </w:p>
-        </w:tc>
-        <w:tc>
-          <w:tcPr>
-            <w:tcW w:type="dxa" w:w="1625"/>
-            <w:vAlign w:val="center"/>
-            <w:tcMar>
-              <w:top w:w="90" w:type="dxa"/>
-              <w:start w:w="100" w:type="dxa"/>
-              <w:bottom w:w="90" w:type="dxa"/>
-              <w:end w:w="100" w:type="dxa"/>
-            </w:tcMar>
-            <w:shd w:fill="0F3557"/>
-          </w:tcPr>
-          <w:p>
-            <w:pPr>
-              <w:spacing w:after="20"/>
-            </w:pPr>
-            <w:r>
-              <w:rPr>
-                <w:b/>
-                <w:color w:val="FFFFFF"/>
-                <w:sz w:val="17"/>
-              </w:rPr>
-              <w:t>Fontes principais</w:t>
-            </w:r>
-          </w:p>
-        </w:tc>
-        <w:tc>
-          <w:tcPr>
-            <w:tcW w:type="dxa" w:w="1625"/>
-            <w:vAlign w:val="center"/>
-            <w:tcMar>
-              <w:top w:w="90" w:type="dxa"/>
-              <w:start w:w="100" w:type="dxa"/>
-              <w:bottom w:w="90" w:type="dxa"/>
-              <w:end w:w="100" w:type="dxa"/>
-            </w:tcMar>
-            <w:shd w:fill="0F3557"/>
-          </w:tcPr>
-          <w:p>
-            <w:pPr>
-              <w:spacing w:after="20"/>
-            </w:pPr>
-            <w:r>
-              <w:rPr>
-                <w:b/>
-                <w:color w:val="FFFFFF"/>
-                <w:sz w:val="17"/>
-              </w:rPr>
-              <w:t>Execução RAG/juiz</w:t>
+              <w:t>Resultado</w:t>
             </w:r>
           </w:p>
         </w:tc>
@@ -2491,7 +2431,7 @@
       <w:tr>
         <w:tc>
           <w:tcPr>
-            <w:tcW w:type="dxa" w:w="1625"/>
+            <w:tcW w:type="dxa" w:w="4876"/>
             <w:vAlign w:val="center"/>
             <w:tcMar>
               <w:top w:w="90" w:type="dxa"/>
@@ -2508,13 +2448,13 @@
               <w:rPr>
                 <w:sz w:val="17"/>
               </w:rPr>
-              <w:t>1</w:t>
+              <w:t>Sem RAG</w:t>
             </w:r>
           </w:p>
         </w:tc>
         <w:tc>
           <w:tcPr>
-            <w:tcW w:type="dxa" w:w="1625"/>
+            <w:tcW w:type="dxa" w:w="4876"/>
             <w:vAlign w:val="center"/>
             <w:tcMar>
               <w:top w:w="90" w:type="dxa"/>
@@ -2531,99 +2471,7 @@
               <w:rPr>
                 <w:sz w:val="17"/>
               </w:rPr>
-              <w:t>Documentos para abrir conta</w:t>
-            </w:r>
-          </w:p>
-        </w:tc>
-        <w:tc>
-          <w:tcPr>
-            <w:tcW w:type="dxa" w:w="1625"/>
-            <w:vAlign w:val="center"/>
-            <w:tcMar>
-              <w:top w:w="90" w:type="dxa"/>
-              <w:start w:w="100" w:type="dxa"/>
-              <w:bottom w:w="90" w:type="dxa"/>
-              <w:end w:w="100" w:type="dxa"/>
-            </w:tcMar>
-          </w:tcPr>
-          <w:p>
-            <w:pPr>
-              <w:spacing w:after="20"/>
-            </w:pPr>
-            <w:r>
-              <w:rPr>
-                <w:sz w:val="17"/>
-              </w:rPr>
-              <w:t>100</w:t>
-            </w:r>
-          </w:p>
-        </w:tc>
-        <w:tc>
-          <w:tcPr>
-            <w:tcW w:type="dxa" w:w="1625"/>
-            <w:vAlign w:val="center"/>
-            <w:tcMar>
-              <w:top w:w="90" w:type="dxa"/>
-              <w:start w:w="100" w:type="dxa"/>
-              <w:bottom w:w="90" w:type="dxa"/>
-              <w:end w:w="100" w:type="dxa"/>
-            </w:tcMar>
-          </w:tcPr>
-          <w:p>
-            <w:pPr>
-              <w:spacing w:after="20"/>
-            </w:pPr>
-            <w:r>
-              <w:rPr>
-                <w:sz w:val="17"/>
-              </w:rPr>
-              <w:t>100</w:t>
-            </w:r>
-          </w:p>
-        </w:tc>
-        <w:tc>
-          <w:tcPr>
-            <w:tcW w:type="dxa" w:w="1625"/>
-            <w:vAlign w:val="center"/>
-            <w:tcMar>
-              <w:top w:w="90" w:type="dxa"/>
-              <w:start w:w="100" w:type="dxa"/>
-              <w:bottom w:w="90" w:type="dxa"/>
-              <w:end w:w="100" w:type="dxa"/>
-            </w:tcMar>
-          </w:tcPr>
-          <w:p>
-            <w:pPr>
-              <w:spacing w:after="20"/>
-            </w:pPr>
-            <w:r>
-              <w:rPr>
-                <w:sz w:val="17"/>
-              </w:rPr>
-              <w:t>1, 2, 50, 28</w:t>
-            </w:r>
-          </w:p>
-        </w:tc>
-        <w:tc>
-          <w:tcPr>
-            <w:tcW w:type="dxa" w:w="1625"/>
-            <w:vAlign w:val="center"/>
-            <w:tcMar>
-              <w:top w:w="90" w:type="dxa"/>
-              <w:start w:w="100" w:type="dxa"/>
-              <w:bottom w:w="90" w:type="dxa"/>
-              <w:end w:w="100" w:type="dxa"/>
-            </w:tcMar>
-          </w:tcPr>
-          <w:p>
-            <w:pPr>
-              <w:spacing w:after="20"/>
-            </w:pPr>
-            <w:r>
-              <w:rPr>
-                <w:sz w:val="17"/>
-              </w:rPr>
-              <w:t>Gemini/Gemini</w:t>
+              <w:t>12/32 - 37,5%</w:t>
             </w:r>
           </w:p>
         </w:tc>
@@ -2631,7 +2479,7 @@
       <w:tr>
         <w:tc>
           <w:tcPr>
-            <w:tcW w:type="dxa" w:w="1625"/>
+            <w:tcW w:type="dxa" w:w="4876"/>
             <w:vAlign w:val="center"/>
             <w:tcMar>
               <w:top w:w="90" w:type="dxa"/>
@@ -2649,13 +2497,13 @@
               <w:rPr>
                 <w:sz w:val="17"/>
               </w:rPr>
-              <w:t>2</w:t>
+              <w:t>Com RAG</w:t>
             </w:r>
           </w:p>
         </w:tc>
         <w:tc>
           <w:tcPr>
-            <w:tcW w:type="dxa" w:w="1625"/>
+            <w:tcW w:type="dxa" w:w="4876"/>
             <w:vAlign w:val="center"/>
             <w:tcMar>
               <w:top w:w="90" w:type="dxa"/>
@@ -2673,13 +2521,63 @@
               <w:rPr>
                 <w:sz w:val="17"/>
               </w:rPr>
-              <w:t>Custo da TED adicional</w:t>
+              <w:t>28/32 - 87,5%</w:t>
+            </w:r>
+          </w:p>
+        </w:tc>
+      </w:tr>
+      <w:tr>
+        <w:tc>
+          <w:tcPr>
+            <w:tcW w:type="dxa" w:w="4876"/>
+            <w:vAlign w:val="center"/>
+            <w:tcMar>
+              <w:top w:w="90" w:type="dxa"/>
+              <w:start w:w="100" w:type="dxa"/>
+              <w:bottom w:w="90" w:type="dxa"/>
+              <w:end w:w="100" w:type="dxa"/>
+            </w:tcMar>
+          </w:tcPr>
+          <w:p>
+            <w:pPr>
+              <w:spacing w:after="20"/>
+            </w:pPr>
+            <w:r>
+              <w:rPr>
+                <w:sz w:val="17"/>
+              </w:rPr>
+              <w:t>Geração Gemini</w:t>
             </w:r>
           </w:p>
         </w:tc>
         <w:tc>
           <w:tcPr>
-            <w:tcW w:type="dxa" w:w="1625"/>
+            <w:tcW w:type="dxa" w:w="4876"/>
+            <w:vAlign w:val="center"/>
+            <w:tcMar>
+              <w:top w:w="90" w:type="dxa"/>
+              <w:start w:w="100" w:type="dxa"/>
+              <w:bottom w:w="90" w:type="dxa"/>
+              <w:end w:w="100" w:type="dxa"/>
+            </w:tcMar>
+          </w:tcPr>
+          <w:p>
+            <w:pPr>
+              <w:spacing w:after="20"/>
+            </w:pPr>
+            <w:r>
+              <w:rPr>
+                <w:sz w:val="17"/>
+              </w:rPr>
+              <w:t>32/32</w:t>
+            </w:r>
+          </w:p>
+        </w:tc>
+      </w:tr>
+      <w:tr>
+        <w:tc>
+          <w:tcPr>
+            <w:tcW w:type="dxa" w:w="4876"/>
             <w:vAlign w:val="center"/>
             <w:tcMar>
               <w:top w:w="90" w:type="dxa"/>
@@ -2697,13 +2595,13 @@
               <w:rPr>
                 <w:sz w:val="17"/>
               </w:rPr>
-              <w:t>0</w:t>
+              <w:t>Julgamento com fallback local</w:t>
             </w:r>
           </w:p>
         </w:tc>
         <w:tc>
           <w:tcPr>
-            <w:tcW w:type="dxa" w:w="1625"/>
+            <w:tcW w:type="dxa" w:w="4876"/>
             <w:vAlign w:val="center"/>
             <w:tcMar>
               <w:top w:w="90" w:type="dxa"/>
@@ -2721,913 +2619,7 @@
               <w:rPr>
                 <w:sz w:val="17"/>
               </w:rPr>
-              <w:t>100</w:t>
-            </w:r>
-          </w:p>
-        </w:tc>
-        <w:tc>
-          <w:tcPr>
-            <w:tcW w:type="dxa" w:w="1625"/>
-            <w:vAlign w:val="center"/>
-            <w:tcMar>
-              <w:top w:w="90" w:type="dxa"/>
-              <w:start w:w="100" w:type="dxa"/>
-              <w:bottom w:w="90" w:type="dxa"/>
-              <w:end w:w="100" w:type="dxa"/>
-            </w:tcMar>
-            <w:shd w:fill="EAF4FB"/>
-          </w:tcPr>
-          <w:p>
-            <w:pPr>
-              <w:spacing w:after="20"/>
-            </w:pPr>
-            <w:r>
-              <w:rPr>
-                <w:sz w:val="17"/>
-              </w:rPr>
-              <w:t>3, 30, 25, 36</w:t>
-            </w:r>
-          </w:p>
-        </w:tc>
-        <w:tc>
-          <w:tcPr>
-            <w:tcW w:type="dxa" w:w="1625"/>
-            <w:vAlign w:val="center"/>
-            <w:tcMar>
-              <w:top w:w="90" w:type="dxa"/>
-              <w:start w:w="100" w:type="dxa"/>
-              <w:bottom w:w="90" w:type="dxa"/>
-              <w:end w:w="100" w:type="dxa"/>
-            </w:tcMar>
-            <w:shd w:fill="EAF4FB"/>
-          </w:tcPr>
-          <w:p>
-            <w:pPr>
-              <w:spacing w:after="20"/>
-            </w:pPr>
-            <w:r>
-              <w:rPr>
-                <w:sz w:val="17"/>
-              </w:rPr>
-              <w:t>Gemini/Gemini</w:t>
-            </w:r>
-          </w:p>
-        </w:tc>
-      </w:tr>
-      <w:tr>
-        <w:tc>
-          <w:tcPr>
-            <w:tcW w:type="dxa" w:w="1625"/>
-            <w:vAlign w:val="center"/>
-            <w:tcMar>
-              <w:top w:w="90" w:type="dxa"/>
-              <w:start w:w="100" w:type="dxa"/>
-              <w:bottom w:w="90" w:type="dxa"/>
-              <w:end w:w="100" w:type="dxa"/>
-            </w:tcMar>
-          </w:tcPr>
-          <w:p>
-            <w:pPr>
-              <w:spacing w:after="20"/>
-            </w:pPr>
-            <w:r>
-              <w:rPr>
-                <w:sz w:val="17"/>
-              </w:rPr>
-              <w:t>3</w:t>
-            </w:r>
-          </w:p>
-        </w:tc>
-        <w:tc>
-          <w:tcPr>
-            <w:tcW w:type="dxa" w:w="1625"/>
-            <w:vAlign w:val="center"/>
-            <w:tcMar>
-              <w:top w:w="90" w:type="dxa"/>
-              <w:start w:w="100" w:type="dxa"/>
-              <w:bottom w:w="90" w:type="dxa"/>
-              <w:end w:w="100" w:type="dxa"/>
-            </w:tcMar>
-          </w:tcPr>
-          <w:p>
-            <w:pPr>
-              <w:spacing w:after="20"/>
-            </w:pPr>
-            <w:r>
-              <w:rPr>
-                <w:sz w:val="17"/>
-              </w:rPr>
-              <w:t>Anuidade do Platinum</w:t>
-            </w:r>
-          </w:p>
-        </w:tc>
-        <w:tc>
-          <w:tcPr>
-            <w:tcW w:type="dxa" w:w="1625"/>
-            <w:vAlign w:val="center"/>
-            <w:tcMar>
-              <w:top w:w="90" w:type="dxa"/>
-              <w:start w:w="100" w:type="dxa"/>
-              <w:bottom w:w="90" w:type="dxa"/>
-              <w:end w:w="100" w:type="dxa"/>
-            </w:tcMar>
-          </w:tcPr>
-          <w:p>
-            <w:pPr>
-              <w:spacing w:after="20"/>
-            </w:pPr>
-            <w:r>
-              <w:rPr>
-                <w:sz w:val="17"/>
-              </w:rPr>
-              <w:t>0</w:t>
-            </w:r>
-          </w:p>
-        </w:tc>
-        <w:tc>
-          <w:tcPr>
-            <w:tcW w:type="dxa" w:w="1625"/>
-            <w:vAlign w:val="center"/>
-            <w:tcMar>
-              <w:top w:w="90" w:type="dxa"/>
-              <w:start w:w="100" w:type="dxa"/>
-              <w:bottom w:w="90" w:type="dxa"/>
-              <w:end w:w="100" w:type="dxa"/>
-            </w:tcMar>
-          </w:tcPr>
-          <w:p>
-            <w:pPr>
-              <w:spacing w:after="20"/>
-            </w:pPr>
-            <w:r>
-              <w:rPr>
-                <w:sz w:val="17"/>
-              </w:rPr>
-              <w:t>100</w:t>
-            </w:r>
-          </w:p>
-        </w:tc>
-        <w:tc>
-          <w:tcPr>
-            <w:tcW w:type="dxa" w:w="1625"/>
-            <w:vAlign w:val="center"/>
-            <w:tcMar>
-              <w:top w:w="90" w:type="dxa"/>
-              <w:start w:w="100" w:type="dxa"/>
-              <w:bottom w:w="90" w:type="dxa"/>
-              <w:end w:w="100" w:type="dxa"/>
-            </w:tcMar>
-          </w:tcPr>
-          <w:p>
-            <w:pPr>
-              <w:spacing w:after="20"/>
-            </w:pPr>
-            <w:r>
-              <w:rPr>
-                <w:sz w:val="17"/>
-              </w:rPr>
-              <w:t>9, 36, 11, 45</w:t>
-            </w:r>
-          </w:p>
-        </w:tc>
-        <w:tc>
-          <w:tcPr>
-            <w:tcW w:type="dxa" w:w="1625"/>
-            <w:vAlign w:val="center"/>
-            <w:tcMar>
-              <w:top w:w="90" w:type="dxa"/>
-              <w:start w:w="100" w:type="dxa"/>
-              <w:bottom w:w="90" w:type="dxa"/>
-              <w:end w:w="100" w:type="dxa"/>
-            </w:tcMar>
-          </w:tcPr>
-          <w:p>
-            <w:pPr>
-              <w:spacing w:after="20"/>
-            </w:pPr>
-            <w:r>
-              <w:rPr>
-                <w:sz w:val="17"/>
-              </w:rPr>
-              <w:t>Gemini/Gemini</w:t>
-            </w:r>
-          </w:p>
-        </w:tc>
-      </w:tr>
-      <w:tr>
-        <w:tc>
-          <w:tcPr>
-            <w:tcW w:type="dxa" w:w="1625"/>
-            <w:vAlign w:val="center"/>
-            <w:tcMar>
-              <w:top w:w="90" w:type="dxa"/>
-              <w:start w:w="100" w:type="dxa"/>
-              <w:bottom w:w="90" w:type="dxa"/>
-              <w:end w:w="100" w:type="dxa"/>
-            </w:tcMar>
-            <w:shd w:fill="EAF4FB"/>
-          </w:tcPr>
-          <w:p>
-            <w:pPr>
-              <w:spacing w:after="20"/>
-            </w:pPr>
-            <w:r>
-              <w:rPr>
-                <w:sz w:val="17"/>
-              </w:rPr>
-              <w:t>4</w:t>
-            </w:r>
-          </w:p>
-        </w:tc>
-        <w:tc>
-          <w:tcPr>
-            <w:tcW w:type="dxa" w:w="1625"/>
-            <w:vAlign w:val="center"/>
-            <w:tcMar>
-              <w:top w:w="90" w:type="dxa"/>
-              <w:start w:w="100" w:type="dxa"/>
-              <w:bottom w:w="90" w:type="dxa"/>
-              <w:end w:w="100" w:type="dxa"/>
-            </w:tcMar>
-            <w:shd w:fill="EAF4FB"/>
-          </w:tcPr>
-          <w:p>
-            <w:pPr>
-              <w:spacing w:after="20"/>
-            </w:pPr>
-            <w:r>
-              <w:rPr>
-                <w:sz w:val="17"/>
-              </w:rPr>
-              <w:t>Limite máximo Gold</w:t>
-            </w:r>
-          </w:p>
-        </w:tc>
-        <w:tc>
-          <w:tcPr>
-            <w:tcW w:type="dxa" w:w="1625"/>
-            <w:vAlign w:val="center"/>
-            <w:tcMar>
-              <w:top w:w="90" w:type="dxa"/>
-              <w:start w:w="100" w:type="dxa"/>
-              <w:bottom w:w="90" w:type="dxa"/>
-              <w:end w:w="100" w:type="dxa"/>
-            </w:tcMar>
-            <w:shd w:fill="EAF4FB"/>
-          </w:tcPr>
-          <w:p>
-            <w:pPr>
-              <w:spacing w:after="20"/>
-            </w:pPr>
-            <w:r>
-              <w:rPr>
-                <w:sz w:val="17"/>
-              </w:rPr>
-              <w:t>0</w:t>
-            </w:r>
-          </w:p>
-        </w:tc>
-        <w:tc>
-          <w:tcPr>
-            <w:tcW w:type="dxa" w:w="1625"/>
-            <w:vAlign w:val="center"/>
-            <w:tcMar>
-              <w:top w:w="90" w:type="dxa"/>
-              <w:start w:w="100" w:type="dxa"/>
-              <w:bottom w:w="90" w:type="dxa"/>
-              <w:end w:w="100" w:type="dxa"/>
-            </w:tcMar>
-            <w:shd w:fill="EAF4FB"/>
-          </w:tcPr>
-          <w:p>
-            <w:pPr>
-              <w:spacing w:after="20"/>
-            </w:pPr>
-            <w:r>
-              <w:rPr>
-                <w:sz w:val="17"/>
-              </w:rPr>
-              <w:t>100</w:t>
-            </w:r>
-          </w:p>
-        </w:tc>
-        <w:tc>
-          <w:tcPr>
-            <w:tcW w:type="dxa" w:w="1625"/>
-            <w:vAlign w:val="center"/>
-            <w:tcMar>
-              <w:top w:w="90" w:type="dxa"/>
-              <w:start w:w="100" w:type="dxa"/>
-              <w:bottom w:w="90" w:type="dxa"/>
-              <w:end w:w="100" w:type="dxa"/>
-            </w:tcMar>
-            <w:shd w:fill="EAF4FB"/>
-          </w:tcPr>
-          <w:p>
-            <w:pPr>
-              <w:spacing w:after="20"/>
-            </w:pPr>
-            <w:r>
-              <w:rPr>
-                <w:sz w:val="17"/>
-              </w:rPr>
-              <w:t>11, 9, 7, 13</w:t>
-            </w:r>
-          </w:p>
-        </w:tc>
-        <w:tc>
-          <w:tcPr>
-            <w:tcW w:type="dxa" w:w="1625"/>
-            <w:vAlign w:val="center"/>
-            <w:tcMar>
-              <w:top w:w="90" w:type="dxa"/>
-              <w:start w:w="100" w:type="dxa"/>
-              <w:bottom w:w="90" w:type="dxa"/>
-              <w:end w:w="100" w:type="dxa"/>
-            </w:tcMar>
-            <w:shd w:fill="EAF4FB"/>
-          </w:tcPr>
-          <w:p>
-            <w:pPr>
-              <w:spacing w:after="20"/>
-            </w:pPr>
-            <w:r>
-              <w:rPr>
-                <w:sz w:val="17"/>
-              </w:rPr>
-              <w:t>Local/Local - 429</w:t>
-            </w:r>
-          </w:p>
-        </w:tc>
-      </w:tr>
-      <w:tr>
-        <w:tc>
-          <w:tcPr>
-            <w:tcW w:type="dxa" w:w="1625"/>
-            <w:vAlign w:val="center"/>
-            <w:tcMar>
-              <w:top w:w="90" w:type="dxa"/>
-              <w:start w:w="100" w:type="dxa"/>
-              <w:bottom w:w="90" w:type="dxa"/>
-              <w:end w:w="100" w:type="dxa"/>
-            </w:tcMar>
-          </w:tcPr>
-          <w:p>
-            <w:pPr>
-              <w:spacing w:after="20"/>
-            </w:pPr>
-            <w:r>
-              <w:rPr>
-                <w:sz w:val="17"/>
-              </w:rPr>
-              <w:t>5</w:t>
-            </w:r>
-          </w:p>
-        </w:tc>
-        <w:tc>
-          <w:tcPr>
-            <w:tcW w:type="dxa" w:w="1625"/>
-            <w:vAlign w:val="center"/>
-            <w:tcMar>
-              <w:top w:w="90" w:type="dxa"/>
-              <w:start w:w="100" w:type="dxa"/>
-              <w:bottom w:w="90" w:type="dxa"/>
-              <w:end w:w="100" w:type="dxa"/>
-            </w:tcMar>
-          </w:tcPr>
-          <w:p>
-            <w:pPr>
-              <w:spacing w:after="20"/>
-            </w:pPr>
-            <w:r>
-              <w:rPr>
-                <w:sz w:val="17"/>
-              </w:rPr>
-              <w:t>Contestação de transação</w:t>
-            </w:r>
-          </w:p>
-        </w:tc>
-        <w:tc>
-          <w:tcPr>
-            <w:tcW w:type="dxa" w:w="1625"/>
-            <w:vAlign w:val="center"/>
-            <w:tcMar>
-              <w:top w:w="90" w:type="dxa"/>
-              <w:start w:w="100" w:type="dxa"/>
-              <w:bottom w:w="90" w:type="dxa"/>
-              <w:end w:w="100" w:type="dxa"/>
-            </w:tcMar>
-          </w:tcPr>
-          <w:p>
-            <w:pPr>
-              <w:spacing w:after="20"/>
-            </w:pPr>
-            <w:r>
-              <w:rPr>
-                <w:sz w:val="17"/>
-              </w:rPr>
-              <w:t>0</w:t>
-            </w:r>
-          </w:p>
-        </w:tc>
-        <w:tc>
-          <w:tcPr>
-            <w:tcW w:type="dxa" w:w="1625"/>
-            <w:vAlign w:val="center"/>
-            <w:tcMar>
-              <w:top w:w="90" w:type="dxa"/>
-              <w:start w:w="100" w:type="dxa"/>
-              <w:bottom w:w="90" w:type="dxa"/>
-              <w:end w:w="100" w:type="dxa"/>
-            </w:tcMar>
-          </w:tcPr>
-          <w:p>
-            <w:pPr>
-              <w:spacing w:after="20"/>
-            </w:pPr>
-            <w:r>
-              <w:rPr>
-                <w:sz w:val="17"/>
-              </w:rPr>
-              <w:t>100</w:t>
-            </w:r>
-          </w:p>
-        </w:tc>
-        <w:tc>
-          <w:tcPr>
-            <w:tcW w:type="dxa" w:w="1625"/>
-            <w:vAlign w:val="center"/>
-            <w:tcMar>
-              <w:top w:w="90" w:type="dxa"/>
-              <w:start w:w="100" w:type="dxa"/>
-              <w:bottom w:w="90" w:type="dxa"/>
-              <w:end w:w="100" w:type="dxa"/>
-            </w:tcMar>
-          </w:tcPr>
-          <w:p>
-            <w:pPr>
-              <w:spacing w:after="20"/>
-            </w:pPr>
-            <w:r>
-              <w:rPr>
-                <w:sz w:val="17"/>
-              </w:rPr>
-              <w:t>30, 9, 46, 1</w:t>
-            </w:r>
-          </w:p>
-        </w:tc>
-        <w:tc>
-          <w:tcPr>
-            <w:tcW w:type="dxa" w:w="1625"/>
-            <w:vAlign w:val="center"/>
-            <w:tcMar>
-              <w:top w:w="90" w:type="dxa"/>
-              <w:start w:w="100" w:type="dxa"/>
-              <w:bottom w:w="90" w:type="dxa"/>
-              <w:end w:w="100" w:type="dxa"/>
-            </w:tcMar>
-          </w:tcPr>
-          <w:p>
-            <w:pPr>
-              <w:spacing w:after="20"/>
-            </w:pPr>
-            <w:r>
-              <w:rPr>
-                <w:sz w:val="17"/>
-              </w:rPr>
-              <w:t>Local/Local - 429</w:t>
-            </w:r>
-          </w:p>
-        </w:tc>
-      </w:tr>
-      <w:tr>
-        <w:tc>
-          <w:tcPr>
-            <w:tcW w:type="dxa" w:w="1625"/>
-            <w:vAlign w:val="center"/>
-            <w:tcMar>
-              <w:top w:w="90" w:type="dxa"/>
-              <w:start w:w="100" w:type="dxa"/>
-              <w:bottom w:w="90" w:type="dxa"/>
-              <w:end w:w="100" w:type="dxa"/>
-            </w:tcMar>
-            <w:shd w:fill="EAF4FB"/>
-          </w:tcPr>
-          <w:p>
-            <w:pPr>
-              <w:spacing w:after="20"/>
-            </w:pPr>
-            <w:r>
-              <w:rPr>
-                <w:sz w:val="17"/>
-              </w:rPr>
-              <w:t>6</w:t>
-            </w:r>
-          </w:p>
-        </w:tc>
-        <w:tc>
-          <w:tcPr>
-            <w:tcW w:type="dxa" w:w="1625"/>
-            <w:vAlign w:val="center"/>
-            <w:tcMar>
-              <w:top w:w="90" w:type="dxa"/>
-              <w:start w:w="100" w:type="dxa"/>
-              <w:bottom w:w="90" w:type="dxa"/>
-              <w:end w:w="100" w:type="dxa"/>
-            </w:tcMar>
-            <w:shd w:fill="EAF4FB"/>
-          </w:tcPr>
-          <w:p>
-            <w:pPr>
-              <w:spacing w:after="20"/>
-            </w:pPr>
-            <w:r>
-              <w:rPr>
-                <w:sz w:val="17"/>
-              </w:rPr>
-              <w:t>Exclusão de dados pessoais</w:t>
-            </w:r>
-          </w:p>
-        </w:tc>
-        <w:tc>
-          <w:tcPr>
-            <w:tcW w:type="dxa" w:w="1625"/>
-            <w:vAlign w:val="center"/>
-            <w:tcMar>
-              <w:top w:w="90" w:type="dxa"/>
-              <w:start w:w="100" w:type="dxa"/>
-              <w:bottom w:w="90" w:type="dxa"/>
-              <w:end w:w="100" w:type="dxa"/>
-            </w:tcMar>
-            <w:shd w:fill="EAF4FB"/>
-          </w:tcPr>
-          <w:p>
-            <w:pPr>
-              <w:spacing w:after="20"/>
-            </w:pPr>
-            <w:r>
-              <w:rPr>
-                <w:sz w:val="17"/>
-              </w:rPr>
-              <w:t>0</w:t>
-            </w:r>
-          </w:p>
-        </w:tc>
-        <w:tc>
-          <w:tcPr>
-            <w:tcW w:type="dxa" w:w="1625"/>
-            <w:vAlign w:val="center"/>
-            <w:tcMar>
-              <w:top w:w="90" w:type="dxa"/>
-              <w:start w:w="100" w:type="dxa"/>
-              <w:bottom w:w="90" w:type="dxa"/>
-              <w:end w:w="100" w:type="dxa"/>
-            </w:tcMar>
-            <w:shd w:fill="EAF4FB"/>
-          </w:tcPr>
-          <w:p>
-            <w:pPr>
-              <w:spacing w:after="20"/>
-            </w:pPr>
-            <w:r>
-              <w:rPr>
-                <w:sz w:val="17"/>
-              </w:rPr>
-              <w:t>100</w:t>
-            </w:r>
-          </w:p>
-        </w:tc>
-        <w:tc>
-          <w:tcPr>
-            <w:tcW w:type="dxa" w:w="1625"/>
-            <w:vAlign w:val="center"/>
-            <w:tcMar>
-              <w:top w:w="90" w:type="dxa"/>
-              <w:start w:w="100" w:type="dxa"/>
-              <w:bottom w:w="90" w:type="dxa"/>
-              <w:end w:w="100" w:type="dxa"/>
-            </w:tcMar>
-            <w:shd w:fill="EAF4FB"/>
-          </w:tcPr>
-          <w:p>
-            <w:pPr>
-              <w:spacing w:after="20"/>
-            </w:pPr>
-            <w:r>
-              <w:rPr>
-                <w:sz w:val="17"/>
-              </w:rPr>
-              <w:t>28, 5, 26, 50</w:t>
-            </w:r>
-          </w:p>
-        </w:tc>
-        <w:tc>
-          <w:tcPr>
-            <w:tcW w:type="dxa" w:w="1625"/>
-            <w:vAlign w:val="center"/>
-            <w:tcMar>
-              <w:top w:w="90" w:type="dxa"/>
-              <w:start w:w="100" w:type="dxa"/>
-              <w:bottom w:w="90" w:type="dxa"/>
-              <w:end w:w="100" w:type="dxa"/>
-            </w:tcMar>
-            <w:shd w:fill="EAF4FB"/>
-          </w:tcPr>
-          <w:p>
-            <w:pPr>
-              <w:spacing w:after="20"/>
-            </w:pPr>
-            <w:r>
-              <w:rPr>
-                <w:sz w:val="17"/>
-              </w:rPr>
-              <w:t>Local/Local - 429</w:t>
-            </w:r>
-          </w:p>
-        </w:tc>
-      </w:tr>
-      <w:tr>
-        <w:tc>
-          <w:tcPr>
-            <w:tcW w:type="dxa" w:w="1625"/>
-            <w:vAlign w:val="center"/>
-            <w:tcMar>
-              <w:top w:w="90" w:type="dxa"/>
-              <w:start w:w="100" w:type="dxa"/>
-              <w:bottom w:w="90" w:type="dxa"/>
-              <w:end w:w="100" w:type="dxa"/>
-            </w:tcMar>
-          </w:tcPr>
-          <w:p>
-            <w:pPr>
-              <w:spacing w:after="20"/>
-            </w:pPr>
-            <w:r>
-              <w:rPr>
-                <w:sz w:val="17"/>
-              </w:rPr>
-              <w:t>7</w:t>
-            </w:r>
-          </w:p>
-        </w:tc>
-        <w:tc>
-          <w:tcPr>
-            <w:tcW w:type="dxa" w:w="1625"/>
-            <w:vAlign w:val="center"/>
-            <w:tcMar>
-              <w:top w:w="90" w:type="dxa"/>
-              <w:start w:w="100" w:type="dxa"/>
-              <w:bottom w:w="90" w:type="dxa"/>
-              <w:end w:w="100" w:type="dxa"/>
-            </w:tcMar>
-          </w:tcPr>
-          <w:p>
-            <w:pPr>
-              <w:spacing w:after="20"/>
-            </w:pPr>
-            <w:r>
-              <w:rPr>
-                <w:sz w:val="17"/>
-              </w:rPr>
-              <w:t>Prazo da ouvidoria</w:t>
-            </w:r>
-          </w:p>
-        </w:tc>
-        <w:tc>
-          <w:tcPr>
-            <w:tcW w:type="dxa" w:w="1625"/>
-            <w:vAlign w:val="center"/>
-            <w:tcMar>
-              <w:top w:w="90" w:type="dxa"/>
-              <w:start w:w="100" w:type="dxa"/>
-              <w:bottom w:w="90" w:type="dxa"/>
-              <w:end w:w="100" w:type="dxa"/>
-            </w:tcMar>
-          </w:tcPr>
-          <w:p>
-            <w:pPr>
-              <w:spacing w:after="20"/>
-            </w:pPr>
-            <w:r>
-              <w:rPr>
-                <w:sz w:val="17"/>
-              </w:rPr>
-              <w:t>0</w:t>
-            </w:r>
-          </w:p>
-        </w:tc>
-        <w:tc>
-          <w:tcPr>
-            <w:tcW w:type="dxa" w:w="1625"/>
-            <w:vAlign w:val="center"/>
-            <w:tcMar>
-              <w:top w:w="90" w:type="dxa"/>
-              <w:start w:w="100" w:type="dxa"/>
-              <w:bottom w:w="90" w:type="dxa"/>
-              <w:end w:w="100" w:type="dxa"/>
-            </w:tcMar>
-          </w:tcPr>
-          <w:p>
-            <w:pPr>
-              <w:spacing w:after="20"/>
-            </w:pPr>
-            <w:r>
-              <w:rPr>
-                <w:sz w:val="17"/>
-              </w:rPr>
-              <w:t>100</w:t>
-            </w:r>
-          </w:p>
-        </w:tc>
-        <w:tc>
-          <w:tcPr>
-            <w:tcW w:type="dxa" w:w="1625"/>
-            <w:vAlign w:val="center"/>
-            <w:tcMar>
-              <w:top w:w="90" w:type="dxa"/>
-              <w:start w:w="100" w:type="dxa"/>
-              <w:bottom w:w="90" w:type="dxa"/>
-              <w:end w:w="100" w:type="dxa"/>
-            </w:tcMar>
-          </w:tcPr>
-          <w:p>
-            <w:pPr>
-              <w:spacing w:after="20"/>
-            </w:pPr>
-            <w:r>
-              <w:rPr>
-                <w:sz w:val="17"/>
-              </w:rPr>
-              <w:t>15, 37, 5, 28</w:t>
-            </w:r>
-          </w:p>
-        </w:tc>
-        <w:tc>
-          <w:tcPr>
-            <w:tcW w:type="dxa" w:w="1625"/>
-            <w:vAlign w:val="center"/>
-            <w:tcMar>
-              <w:top w:w="90" w:type="dxa"/>
-              <w:start w:w="100" w:type="dxa"/>
-              <w:bottom w:w="90" w:type="dxa"/>
-              <w:end w:w="100" w:type="dxa"/>
-            </w:tcMar>
-          </w:tcPr>
-          <w:p>
-            <w:pPr>
-              <w:spacing w:after="20"/>
-            </w:pPr>
-            <w:r>
-              <w:rPr>
-                <w:sz w:val="17"/>
-              </w:rPr>
-              <w:t>Local/Local - 429</w:t>
-            </w:r>
-          </w:p>
-        </w:tc>
-      </w:tr>
-      <w:tr>
-        <w:tc>
-          <w:tcPr>
-            <w:tcW w:type="dxa" w:w="1625"/>
-            <w:vAlign w:val="center"/>
-            <w:tcMar>
-              <w:top w:w="90" w:type="dxa"/>
-              <w:start w:w="100" w:type="dxa"/>
-              <w:bottom w:w="90" w:type="dxa"/>
-              <w:end w:w="100" w:type="dxa"/>
-            </w:tcMar>
-            <w:shd w:fill="EAF4FB"/>
-          </w:tcPr>
-          <w:p>
-            <w:pPr>
-              <w:spacing w:after="20"/>
-            </w:pPr>
-            <w:r>
-              <w:rPr>
-                <w:sz w:val="17"/>
-              </w:rPr>
-              <w:t>8</w:t>
-            </w:r>
-          </w:p>
-        </w:tc>
-        <w:tc>
-          <w:tcPr>
-            <w:tcW w:type="dxa" w:w="1625"/>
-            <w:vAlign w:val="center"/>
-            <w:tcMar>
-              <w:top w:w="90" w:type="dxa"/>
-              <w:start w:w="100" w:type="dxa"/>
-              <w:bottom w:w="90" w:type="dxa"/>
-              <w:end w:w="100" w:type="dxa"/>
-            </w:tcMar>
-            <w:shd w:fill="EAF4FB"/>
-          </w:tcPr>
-          <w:p>
-            <w:pPr>
-              <w:spacing w:after="20"/>
-            </w:pPr>
-            <w:r>
-              <w:rPr>
-                <w:sz w:val="17"/>
-              </w:rPr>
-              <w:t>Limite do Pix noturno</w:t>
-            </w:r>
-          </w:p>
-        </w:tc>
-        <w:tc>
-          <w:tcPr>
-            <w:tcW w:type="dxa" w:w="1625"/>
-            <w:vAlign w:val="center"/>
-            <w:tcMar>
-              <w:top w:w="90" w:type="dxa"/>
-              <w:start w:w="100" w:type="dxa"/>
-              <w:bottom w:w="90" w:type="dxa"/>
-              <w:end w:w="100" w:type="dxa"/>
-            </w:tcMar>
-            <w:shd w:fill="EAF4FB"/>
-          </w:tcPr>
-          <w:p>
-            <w:pPr>
-              <w:spacing w:after="20"/>
-            </w:pPr>
-            <w:r>
-              <w:rPr>
-                <w:sz w:val="17"/>
-              </w:rPr>
-              <w:t>0</w:t>
-            </w:r>
-          </w:p>
-        </w:tc>
-        <w:tc>
-          <w:tcPr>
-            <w:tcW w:type="dxa" w:w="1625"/>
-            <w:vAlign w:val="center"/>
-            <w:tcMar>
-              <w:top w:w="90" w:type="dxa"/>
-              <w:start w:w="100" w:type="dxa"/>
-              <w:bottom w:w="90" w:type="dxa"/>
-              <w:end w:w="100" w:type="dxa"/>
-            </w:tcMar>
-            <w:shd w:fill="EAF4FB"/>
-          </w:tcPr>
-          <w:p>
-            <w:pPr>
-              <w:spacing w:after="20"/>
-            </w:pPr>
-            <w:r>
-              <w:rPr>
-                <w:sz w:val="17"/>
-              </w:rPr>
-              <w:t>100</w:t>
-            </w:r>
-          </w:p>
-        </w:tc>
-        <w:tc>
-          <w:tcPr>
-            <w:tcW w:type="dxa" w:w="1625"/>
-            <w:vAlign w:val="center"/>
-            <w:tcMar>
-              <w:top w:w="90" w:type="dxa"/>
-              <w:start w:w="100" w:type="dxa"/>
-              <w:bottom w:w="90" w:type="dxa"/>
-              <w:end w:w="100" w:type="dxa"/>
-            </w:tcMar>
-            <w:shd w:fill="EAF4FB"/>
-          </w:tcPr>
-          <w:p>
-            <w:pPr>
-              <w:spacing w:after="20"/>
-            </w:pPr>
-            <w:r>
-              <w:rPr>
-                <w:sz w:val="17"/>
-              </w:rPr>
-              <w:t>32, 31, 11, 29</w:t>
-            </w:r>
-          </w:p>
-        </w:tc>
-        <w:tc>
-          <w:tcPr>
-            <w:tcW w:type="dxa" w:w="1625"/>
-            <w:vAlign w:val="center"/>
-            <w:tcMar>
-              <w:top w:w="90" w:type="dxa"/>
-              <w:start w:w="100" w:type="dxa"/>
-              <w:bottom w:w="90" w:type="dxa"/>
-              <w:end w:w="100" w:type="dxa"/>
-            </w:tcMar>
-            <w:shd w:fill="EAF4FB"/>
-          </w:tcPr>
-          <w:p>
-            <w:pPr>
-              <w:spacing w:after="20"/>
-            </w:pPr>
-            <w:r>
-              <w:rPr>
-                <w:sz w:val="17"/>
-              </w:rPr>
-              <w:t>Local/Local - 429</w:t>
+              <w:t>4/32</w:t>
             </w:r>
           </w:p>
         </w:tc>
@@ -3648,7 +2640,7 @@
     </w:p>
     <w:p>
       <w:r>
-        <w:t>O ganho de 12,5% para 100% demonstra a contribuição do contexto recuperado neste dataset, não uma garantia de desempenho em produção. Cinco casos acionaram fallback por limite HTTP 429; logo, o resultado deve ser descrito como RAG híbrido rastreável. Uma avaliação produtiva deve ampliar amostra, separar modelo gerador e juiz, incluir revisão humana, medir recall de recuperação e testar consultas adversariais e controles de acesso.</w:t>
+        <w:t>O ganho de 37,5% para 87,5% demonstra a contribuição do contexto recuperado nesta massa ampliada, não uma garantia de desempenho em produção. Quatro julgamentos acionaram fallback local; logo, o resultado deve ser descrito como RAG rastreável com avaliação parcialmente externa. A próxima rodada deve usar modelo ou provedor de juiz distinto e incluir revisão humana amostral.</w:t>
       </w:r>
     </w:p>
     <w:p>
@@ -9200,7 +8192,6 @@
       <w:pStyle w:val="Footer"/>
       <w:jc w:val="right"/>
     </w:pPr>
-    <w:r/>
     <w:r>
       <w:rPr>
         <w:sz w:val="16"/>
@@ -9224,7 +8215,7 @@
         <w:color w:val="0F5A8A"/>
         <w:sz w:val="16"/>
       </w:rPr>
-      <w:t>BYTEBANK  /  AI ECOSYSTEM     RELATÓRIO EXECUTIVO</w:t>
+      <w:t>BYTEBANK  /  AI ECOSYSTEM     EXECUTIVO</w:t>
     </w:r>
   </w:p>
 </w:hdr>

</xml_diff>